<commit_message>
docs: resync Word cure_paresse j7
Co-Authored-By: Claude Opus 4.6 (1M context) <noreply@anthropic.com>
</commit_message>
<xml_diff>
--- a/ECRITS_NIYYAH/cure_paresse.docx
+++ b/ECRITS_NIYYAH/cure_paresse.docx
@@ -3333,7 +3333,7 @@
           <w:sz w:val="22"/>
           <w:szCs w:val="22"/>
         </w:rPr>
-        <w:t xml:space="preserve">Ô Allah, c'est Ta miséricorde que j'espère : ne m'abandonne pas à moi-même le temps d'un clin d'œil, et arrange pour moi toute mon affaire.</w:t>
+        <w:t xml:space="preserve">Ô Allah, c'est Ta miséricorde que j'espère : ne m'abandonne pas à moi-même le temps d'un clin d'œil, et arrange pour moi toute mon affaire. Nulle divinité sauf Toi.</w:t>
       </w:r>
     </w:p>
     <w:p>
@@ -3383,7 +3383,7 @@
           <w:sz w:val="22"/>
           <w:szCs w:val="22"/>
         </w:rPr>
-        <w:t xml:space="preserve">Source : Abû Dâwûd 5090 — hasan (à confirmer)</w:t>
+        <w:t xml:space="preserve">Source : Abû Dâwûd 5090 — hasan (al-Albânî)</w:t>
       </w:r>
     </w:p>
     <w:p>

</xml_diff>